<commit_message>
Tambah paket praktikum 2 dan isi data asli P2 pada skrip pemulihan
- praktikum-02: cek awal, cek mandiri, dan revisi modul 75 menit
  (termasuk dua salah ketik di modul P2)
- P03_pulihkan_p2 dan P04_pulihkan_p3: category_name VARCHAR(60) dan
  data produk Teh Botol, Roti Cokelat, Air Mineral sesuai modul P2

Co-Authored-By: Claude Opus 5.5 <noreply@anthropic.com>
Claude-Session: https://claude.ai/code/session_01Cyj1LcpJihtdkUGg8rmXh8
</commit_message>
<xml_diff>
--- a/praktikum-03/revisi-modul-p03.docx
+++ b/praktikum-03/revisi-modul-p03.docx
@@ -418,58 +418,25 @@
         <w:pStyle w:val="Compact"/>
       </w:pPr>
       <w:r>
-        <w:t xml:space="preserve">Di</w:t>
-      </w:r>
-      <w:r>
-        <w:t xml:space="preserve"> </w:t>
-      </w:r>
-      <w:r>
         <w:rPr>
           <w:rStyle w:val="VerbatimChar"/>
         </w:rPr>
         <w:t xml:space="preserve">P03_pulihkan_p2.sql</w:t>
       </w:r>
       <w:r>
-        <w:t xml:space="preserve">, panjang</w:t>
-      </w:r>
-      <w:r>
-        <w:t xml:space="preserve"> </w:t>
+        <w:t xml:space="preserve"> </w:t>
+      </w:r>
+      <w:r>
+        <w:t xml:space="preserve">memakai struktur dan data yang sama dengan langkah B dan C modul praktikum 2 (</w:t>
       </w:r>
       <w:r>
         <w:rPr>
           <w:rStyle w:val="VerbatimChar"/>
         </w:rPr>
-        <w:t xml:space="preserve">category_name</w:t>
-      </w:r>
-      <w:r>
-        <w:t xml:space="preserve">, nama produk, dan harga P01–P03 berasal dari praktikum 2 dan masih berupa contoh. Baris yang perlu disesuaikan ditandai</w:t>
-      </w:r>
-      <w:r>
-        <w:t xml:space="preserve"> </w:t>
-      </w:r>
-      <w:r>
-        <w:rPr>
-          <w:rStyle w:val="VerbatimChar"/>
-        </w:rPr>
-        <w:t xml:space="preserve">SESUAIKAN P2</w:t>
-      </w:r>
-      <w:r>
-        <w:t xml:space="preserve">. Struktur</w:t>
-      </w:r>
-      <w:r>
-        <w:t xml:space="preserve"> </w:t>
-      </w:r>
-      <w:r>
-        <w:rPr>
-          <w:rStyle w:val="VerbatimChar"/>
-        </w:rPr>
-        <w:t xml:space="preserve">products</w:t>
-      </w:r>
-      <w:r>
-        <w:t xml:space="preserve"> </w:t>
-      </w:r>
-      <w:r>
-        <w:t xml:space="preserve">sudah mengikuti Gambar 1 modul praktikum 3.</w:t>
+        <w:t xml:space="preserve">category_name VARCHAR(60)</w:t>
+      </w:r>
+      <w:r>
+        <w:t xml:space="preserve">; Teh Botol 5000.00, Roti Cokelat 8000.00, Air Mineral 4000.00). Berkas siap dibagikan tanpa penyesuaian.</w:t>
       </w:r>
     </w:p>
     <w:p>
@@ -2228,34 +2195,7 @@
         <w:pStyle w:val="Compact"/>
       </w:pPr>
       <w:r>
-        <w:t xml:space="preserve">Sesuaikan baris bertanda</w:t>
-      </w:r>
-      <w:r>
-        <w:t xml:space="preserve"> </w:t>
-      </w:r>
-      <w:r>
-        <w:rPr>
-          <w:rStyle w:val="VerbatimChar"/>
-        </w:rPr>
-        <w:t xml:space="preserve">SESUAIKAN P2</w:t>
-      </w:r>
-      <w:r>
-        <w:t xml:space="preserve"> </w:t>
-      </w:r>
-      <w:r>
-        <w:t xml:space="preserve">di</w:t>
-      </w:r>
-      <w:r>
-        <w:t xml:space="preserve"> </w:t>
-      </w:r>
-      <w:r>
-        <w:rPr>
-          <w:rStyle w:val="VerbatimChar"/>
-        </w:rPr>
-        <w:t xml:space="preserve">P03_pulihkan_p2.sql</w:t>
-      </w:r>
-      <w:r>
-        <w:t xml:space="preserve">, lalu letakkan ketiga berkas SQL di folder bersama lab, LMS, atau flashdisk.</w:t>
+        <w:t xml:space="preserve">Letakkan ketiga berkas SQL di folder bersama lab, LMS, atau flashdisk.</w:t>
       </w:r>
     </w:p>
     <w:p>

</xml_diff>